<commit_message>
Add Google News education feed to dashboard and detailed quiz & process explanation in PoC document
</commit_message>
<xml_diff>
--- a/TET_Platform_Detailed_PoC_tnteachers.docx
+++ b/TET_Platform_Detailed_PoC_tnteachers.docx
@@ -13,7 +13,7 @@
           <w:color w:val="1E3A8A"/>
           <w:sz w:val="44"/>
         </w:rPr>
-        <w:t>DETAILED PROOF OF CONCEPT &amp; TECHNICAL ARCHITECTURE</w:t>
+        <w:t>COMPREHENSIVE PROOF OF CONCEPT &amp; TECHNICAL BLUEPRINT</w:t>
       </w:r>
     </w:p>
     <w:p>
@@ -27,7 +27,7 @@
           <w:color w:val="0284C7"/>
           <w:sz w:val="24"/>
         </w:rPr>
-        <w:t>Comprehensive Technical Specification &amp; Blueprint</w:t>
+        <w:t>Deep-Dive Technical Operational Manual &amp; Functional Specification</w:t>
         <w:br/>
         <w:t>TET Platform — Tamil Nadu Teachers Welfare Association &amp; School Curriculum Portal</w:t>
         <w:br/>
@@ -88,7 +88,7 @@
           </w:tcPr>
           <w:p>
             <w:r>
-              <w:t>TET Platform (Tamil Nadu Eligibility Test &amp; School Curriculum Portal)</w:t>
+              <w:t>TET Platform (Tamil Nadu Eligibility Test &amp; School Portal)</w:t>
             </w:r>
           </w:p>
         </w:tc>
@@ -208,7 +208,7 @@
           </w:tcPr>
           <w:p>
             <w:r>
-              <w:t>2.0.0 (Comprehensive Technical Blueprint &amp; Functional PoC)</w:t>
+              <w:t>3.0.0 (Comprehensive Technical Blueprint &amp; Operational Manual)</w:t>
             </w:r>
           </w:p>
         </w:tc>
@@ -226,12 +226,12 @@
           <w:color w:val="1E3A8A"/>
           <w:sz w:val="32"/>
         </w:rPr>
-        <w:t>1. Executive Vision &amp; Platform Purpose</w:t>
+        <w:t>1. Executive Overview &amp; Mission Statement</w:t>
       </w:r>
     </w:p>
     <w:p>
       <w:r>
-        <w:t>The TET Platform (tnteachers.in) is an enterprise-grade digital learning portal engineered to empower candidates preparing for the Tamil Nadu Eligibility Test (TET) and school students across Grades 1 through 12 following the Tamil Nadu State Board Curriculum. The ecosystem bridges traditional textbook study with cutting-edge artificial intelligence, offering structured 4-stage sequential learning paths, dynamic practice exam generators, bilingual language toggling, and robust admin governance.</w:t>
+        <w:t>The TET Platform (tnteachers.in) is an state-of-the-art educational portal designed for Tamil Nadu Eligibility Test (TET) candidates and Tamil Nadu State Board school students across Grades 1 to 12. The portal enforces sequential study progression, embeds AI-driven assessment generators, integrates live Google Education News feeds, provides 100% Tamil/English language switching, and gives administrators granular content management controls.</w:t>
       </w:r>
     </w:p>
     <w:p>
@@ -245,7 +245,7 @@
           <w:color w:val="1E3A8A"/>
           <w:sz w:val="32"/>
         </w:rPr>
-        <w:t>2. Core Platform Pillars &amp; Capabilities</w:t>
+        <w:t>2. Core Platform Capabilities &amp; Process Architecture</w:t>
       </w:r>
     </w:p>
     <w:p>
@@ -258,13 +258,13 @@
           <w:b/>
           <w:color w:val="1E3A8A"/>
         </w:rPr>
-        <w:t xml:space="preserve">1. Enforced Sequential Progression: </w:t>
+        <w:t xml:space="preserve">1. Enforced 4-Stage Sequential Progression: </w:t>
       </w:r>
       <w:r>
         <w:rPr>
           <w:color w:val="1F2937"/>
         </w:rPr>
-        <w:t>To maximize knowledge retention, advanced terms and lessons remain locked until prerequisites are satisfied. Students follow a structured path: Stage 1 (PDF Study Notes) -&gt; Stage 2 (Video Lectures) -&gt; Stage 3 (200 AI Practice MCQs) -&gt; Stage 4 (100 Timed Test Questions).</w:t>
+        <w:t>Lessons and terms unlock sequentially (Term 1 -&gt; Term 2 -&gt; Term 3; Lesson 1 -&gt; Lesson 2). Within each lesson, students must complete: Stage 1 (PDF Notes) -&gt; Stage 2 (Video Lectures) -&gt; Stage 3 (200 AI Practice MCQs) -&gt; Stage 4 (100 AI Timed Test).</w:t>
       </w:r>
     </w:p>
     <w:p>
@@ -277,13 +277,13 @@
           <w:b/>
           <w:color w:val="1E3A8A"/>
         </w:rPr>
-        <w:t xml:space="preserve">2. AI-Powered Assessment Engine: </w:t>
+        <w:t xml:space="preserve">2. AI-Driven Quiz &amp; Evaluation Engine: </w:t>
       </w:r>
       <w:r>
         <w:rPr>
           <w:color w:val="1F2937"/>
         </w:rPr>
-        <w:t>Deep integration with Google Gemini 1.5 Flash AI generates curriculum-aligned multiple choice practice sets and timed examinations with instant scoring, answer explanations, and automated zero-cost fallbacks.</w:t>
+        <w:t>Powered by Google Gemini 1.5 Flash AI, generating dynamic practice question banks and 60-minute timed exams with automated scoring, answer rationale, and zero-cost fallback protection.</w:t>
       </w:r>
     </w:p>
     <w:p>
@@ -296,13 +296,13 @@
           <w:b/>
           <w:color w:val="1E3A8A"/>
         </w:rPr>
-        <w:t xml:space="preserve">3. 100% Full-Page Dual Language Toggle: </w:t>
+        <w:t xml:space="preserve">3. Live Google Education News Notification Feed: </w:t>
       </w:r>
       <w:r>
         <w:rPr>
           <w:color w:val="1F2937"/>
         </w:rPr>
-        <w:t>A global top-right toggle (🌐 த / 🌐 EN) seamlessly translates all interface elements, titles, navigation controls, instruction sets, and test modules between Tamil (தமிழ்) and English without page reloads.</w:t>
+        <w:t>Real-time integration fetching live Tamil Nadu School Education, TRB TET Exam notifications, and teacher welfare news directly from Google News RSS feeds.</w:t>
       </w:r>
     </w:p>
     <w:p>
@@ -315,13 +315,13 @@
           <w:b/>
           <w:color w:val="1E3A8A"/>
         </w:rPr>
-        <w:t xml:space="preserve">4. Gamified Student Retention &amp; Streaks: </w:t>
+        <w:t xml:space="preserve">4. 100% Bilingual Dual Language Toggle: </w:t>
       </w:r>
       <w:r>
         <w:rPr>
           <w:color w:val="1F2937"/>
         </w:rPr>
-        <w:t>Includes daily task completion percentage meters, active day streak counters (🔥 Day Streak), dynamic motivational quotes, and milestone achievement badges (Quick Starter, Bronze Scholar, Silver Academic, and 50-Streak Diamond Legend).</w:t>
+        <w:t>Global toggle (🌐 த / 🌐 EN) instantly translating all interface headings, navigation controls, instructions, and test questions between Tamil (தமிழ்) and English.</w:t>
       </w:r>
     </w:p>
     <w:p>
@@ -334,13 +334,13 @@
           <w:b/>
           <w:color w:val="1E3A8A"/>
         </w:rPr>
-        <w:t xml:space="preserve">5. Executive Admin Content Control: </w:t>
+        <w:t xml:space="preserve">5. Gamified Student Retention &amp; Streaks: </w:t>
       </w:r>
       <w:r>
         <w:rPr>
           <w:color w:val="1F2937"/>
         </w:rPr>
-        <w:t>Dedicated admin workflows for uploading Class 1-12 PDFs, video lesson URLs, stream subjects (Physics, Chemistry, Botany, Zoology, Computer Science), custom subjects, and broadcasting platform announcements.</w:t>
+        <w:t>Daily completion percentage meters, active day streak counters (🔥 Day Streak), motivational quotes, and milestone achievement badges (Quick Starter, Bronze Scholar, Silver Academic, 50-Streak Diamond Legend).</w:t>
       </w:r>
     </w:p>
     <w:p>
@@ -354,7 +354,282 @@
           <w:color w:val="1E3A8A"/>
           <w:sz w:val="32"/>
         </w:rPr>
-        <w:t>3. Comprehensive Technical Architecture</w:t>
+        <w:t>3. In-Depth Quiz &amp; Assessment Engine Working Concepts</w:t>
+      </w:r>
+    </w:p>
+    <w:p>
+      <w:r>
+        <w:t>The assessment framework is divided into two specialized examination modes: Stage 3 Practice Mode (200 Questions) and Stage 4 Timed Test Mode (100 Questions).</w:t>
+      </w:r>
+    </w:p>
+    <w:p>
+      <w:pPr>
+        <w:spacing w:before="240" w:after="80"/>
+      </w:pPr>
+      <w:r>
+        <w:rPr>
+          <w:rFonts w:ascii="Calibri" w:hAnsi="Calibri"/>
+          <w:b/>
+          <w:color w:val="0284C7"/>
+          <w:sz w:val="26"/>
+        </w:rPr>
+        <w:t>3.1. Stage 3: 200 AI MCQs Practice Engine Mechanics</w:t>
+      </w:r>
+    </w:p>
+    <w:p>
+      <w:pPr>
+        <w:pStyle w:val="ListBullet"/>
+        <w:spacing w:before="40" w:after="40"/>
+      </w:pPr>
+      <w:r>
+        <w:rPr>
+          <w:b/>
+          <w:color w:val="1E3A8A"/>
+        </w:rPr>
+        <w:t xml:space="preserve">Untimed Mastery Mode: </w:t>
+      </w:r>
+      <w:r>
+        <w:rPr>
+          <w:color w:val="1F2937"/>
+        </w:rPr>
+        <w:t>Designed for low-stress conceptual learning. Students navigate through 200 curriculum-aligned practice questions at their own pace.</w:t>
+      </w:r>
+    </w:p>
+    <w:p>
+      <w:pPr>
+        <w:pStyle w:val="ListBullet"/>
+        <w:spacing w:before="40" w:after="40"/>
+      </w:pPr>
+      <w:r>
+        <w:rPr>
+          <w:b/>
+          <w:color w:val="1E3A8A"/>
+        </w:rPr>
+        <w:t xml:space="preserve">Instant Answer Rationale: </w:t>
+      </w:r>
+      <w:r>
+        <w:rPr>
+          <w:color w:val="1F2937"/>
+        </w:rPr>
+        <w:t>Selecting an option immediately displays visual feedback (green for correct, red for incorrect) along with an AI-generated explanation detailing why the answer is correct.</w:t>
+      </w:r>
+    </w:p>
+    <w:p>
+      <w:pPr>
+        <w:pStyle w:val="ListBullet"/>
+        <w:spacing w:before="40" w:after="40"/>
+      </w:pPr>
+      <w:r>
+        <w:rPr>
+          <w:b/>
+          <w:color w:val="1E3A8A"/>
+        </w:rPr>
+        <w:t xml:space="preserve">Progress Persistence: </w:t>
+      </w:r>
+      <w:r>
+        <w:rPr>
+          <w:color w:val="1F2937"/>
+        </w:rPr>
+        <w:t>Answers are stored in real-time, allowing students to pause and resume practice sessions without losing progress.</w:t>
+      </w:r>
+    </w:p>
+    <w:p>
+      <w:pPr>
+        <w:spacing w:before="240" w:after="80"/>
+      </w:pPr>
+      <w:r>
+        <w:rPr>
+          <w:rFonts w:ascii="Calibri" w:hAnsi="Calibri"/>
+          <w:b/>
+          <w:color w:val="0284C7"/>
+          <w:sz w:val="26"/>
+        </w:rPr>
+        <w:t>3.2. Stage 4: 100 AI Timed Examination Mechanics</w:t>
+      </w:r>
+    </w:p>
+    <w:p>
+      <w:pPr>
+        <w:pStyle w:val="ListBullet"/>
+        <w:spacing w:before="40" w:after="40"/>
+      </w:pPr>
+      <w:r>
+        <w:rPr>
+          <w:b/>
+          <w:color w:val="1E3A8A"/>
+        </w:rPr>
+        <w:t xml:space="preserve">60-Minute Countdown Timer: </w:t>
+      </w:r>
+      <w:r>
+        <w:rPr>
+          <w:color w:val="1F2937"/>
+        </w:rPr>
+        <w:t>Displays a live countdown timer header. When the timer hits 00:00, the exam automatically submits and locks all inputs.</w:t>
+      </w:r>
+    </w:p>
+    <w:p>
+      <w:pPr>
+        <w:pStyle w:val="ListBullet"/>
+        <w:spacing w:before="40" w:after="40"/>
+      </w:pPr>
+      <w:r>
+        <w:rPr>
+          <w:b/>
+          <w:color w:val="1E3A8A"/>
+        </w:rPr>
+        <w:t xml:space="preserve">Pass Threshold (&gt;= 60%): </w:t>
+      </w:r>
+      <w:r>
+        <w:rPr>
+          <w:color w:val="1F2937"/>
+        </w:rPr>
+        <w:t>Scoring 60% or higher (60+ correct answers out of 100) triggers lesson completion, unlocks the subsequent lesson module, and increments the student's daily study streak.</w:t>
+      </w:r>
+    </w:p>
+    <w:p>
+      <w:pPr>
+        <w:pStyle w:val="ListBullet"/>
+        <w:spacing w:before="40" w:after="40"/>
+      </w:pPr>
+      <w:r>
+        <w:rPr>
+          <w:b/>
+          <w:color w:val="1E3A8A"/>
+        </w:rPr>
+        <w:t xml:space="preserve">Detailed Score Breakdown: </w:t>
+      </w:r>
+      <w:r>
+        <w:rPr>
+          <w:color w:val="1F2937"/>
+        </w:rPr>
+        <w:t>Post-submission screen displays final percentage score, pass/retake badge, correct vs incorrect question counts, and itemized answer review.</w:t>
+      </w:r>
+    </w:p>
+    <w:p>
+      <w:pPr>
+        <w:pStyle w:val="ListBullet"/>
+        <w:spacing w:before="40" w:after="40"/>
+      </w:pPr>
+      <w:r>
+        <w:rPr>
+          <w:b/>
+          <w:color w:val="1E3A8A"/>
+        </w:rPr>
+        <w:t xml:space="preserve">Retake Mechanics: </w:t>
+      </w:r>
+      <w:r>
+        <w:rPr>
+          <w:color w:val="1F2937"/>
+        </w:rPr>
+        <w:t>If a student scores below 60%, the lesson remains in 'Needs Retake' status. The student can retake the exam with newly generated AI questions.</w:t>
+      </w:r>
+    </w:p>
+    <w:p>
+      <w:pPr>
+        <w:spacing w:before="240" w:after="80"/>
+      </w:pPr>
+      <w:r>
+        <w:rPr>
+          <w:rFonts w:ascii="Calibri" w:hAnsi="Calibri"/>
+          <w:b/>
+          <w:color w:val="0284C7"/>
+          <w:sz w:val="26"/>
+        </w:rPr>
+        <w:t>3.3. Gemini AI Generation &amp; Zero-Cost Fallback Resiliency</w:t>
+      </w:r>
+    </w:p>
+    <w:p>
+      <w:r>
+        <w:t>The backend queries Google Gemini 1.5 Flash with structured JSON prompts containing class grade, subject, topic, and language medium. If rate limits are reached or API key is omitted, the Zero-Cost Smart Fallback Engine seamlessly supplies verified curriculum questions from local storage with zero downtime.</w:t>
+      </w:r>
+    </w:p>
+    <w:p>
+      <w:pPr>
+        <w:spacing w:before="360" w:after="120"/>
+      </w:pPr>
+      <w:r>
+        <w:rPr>
+          <w:rFonts w:ascii="Calibri" w:hAnsi="Calibri"/>
+          <w:b/>
+          <w:color w:val="1E3A8A"/>
+          <w:sz w:val="32"/>
+        </w:rPr>
+        <w:t>4. Live Google Education News Feed Integration</w:t>
+      </w:r>
+    </w:p>
+    <w:p>
+      <w:r>
+        <w:t>To keep teachers and candidates informed of official announcements, the Student Dashboard includes a live Google News feed module:</w:t>
+      </w:r>
+    </w:p>
+    <w:p>
+      <w:pPr>
+        <w:pStyle w:val="ListBullet"/>
+        <w:spacing w:before="40" w:after="40"/>
+      </w:pPr>
+      <w:r>
+        <w:rPr>
+          <w:b/>
+          <w:color w:val="1E3A8A"/>
+        </w:rPr>
+        <w:t xml:space="preserve">Dynamic RSS Parser: </w:t>
+      </w:r>
+      <w:r>
+        <w:rPr>
+          <w:color w:val="1F2937"/>
+        </w:rPr>
+        <w:t>Fetches live news headlines using search parameters: 'Tamil Nadu education TET teachers school'.</w:t>
+      </w:r>
+    </w:p>
+    <w:p>
+      <w:pPr>
+        <w:pStyle w:val="ListBullet"/>
+        <w:spacing w:before="40" w:after="40"/>
+      </w:pPr>
+      <w:r>
+        <w:rPr>
+          <w:b/>
+          <w:color w:val="1E3A8A"/>
+        </w:rPr>
+        <w:t xml:space="preserve">Real-Time Card Rendering: </w:t>
+      </w:r>
+      <w:r>
+        <w:rPr>
+          <w:color w:val="1F2937"/>
+        </w:rPr>
+        <w:t>Displays news title, category tag (Curriculum Update, TET Notification, Digital Initiative), publisher source (e.g. The Hindu, TRB Portal), date, and direct external link to read full stories.</w:t>
+      </w:r>
+    </w:p>
+    <w:p>
+      <w:pPr>
+        <w:pStyle w:val="ListBullet"/>
+        <w:spacing w:before="40" w:after="40"/>
+      </w:pPr>
+      <w:r>
+        <w:rPr>
+          <w:b/>
+          <w:color w:val="1E3A8A"/>
+        </w:rPr>
+        <w:t xml:space="preserve">Bilingual Translations: </w:t>
+      </w:r>
+      <w:r>
+        <w:rPr>
+          <w:color w:val="1F2937"/>
+        </w:rPr>
+        <w:t>News header and controls dynamically translate based on language selection ('Live Education &amp; TET News Feed' vs 'கல்வி &amp; TET நேரலை செய்திகள்').</w:t>
+      </w:r>
+    </w:p>
+    <w:p>
+      <w:pPr>
+        <w:spacing w:before="360" w:after="120"/>
+      </w:pPr>
+      <w:r>
+        <w:rPr>
+          <w:rFonts w:ascii="Calibri" w:hAnsi="Calibri"/>
+          <w:b/>
+          <w:color w:val="1E3A8A"/>
+          <w:sz w:val="32"/>
+        </w:rPr>
+        <w:t>5. System Technology Architecture</w:t>
       </w:r>
     </w:p>
     <w:tbl>
@@ -394,7 +669,7 @@
                 <w:b/>
                 <w:color w:val="FFFFFF"/>
               </w:rPr>
-              <w:t>Layer</w:t>
+              <w:t>Tier</w:t>
             </w:r>
           </w:p>
         </w:tc>
@@ -436,7 +711,7 @@
                 <w:b/>
                 <w:color w:val="FFFFFF"/>
               </w:rPr>
-              <w:t>Technical Function &amp; Rationale</w:t>
+              <w:t>Operational Purpose &amp; Benefits</w:t>
             </w:r>
           </w:p>
         </w:tc>
@@ -455,7 +730,7 @@
           </w:tcPr>
           <w:p>
             <w:r>
-              <w:t>Frontend Web App</w:t>
+              <w:t>Frontend UI</w:t>
             </w:r>
           </w:p>
         </w:tc>
@@ -489,7 +764,7 @@
           </w:tcPr>
           <w:p>
             <w:r>
-              <w:t>Single Page Application (SPA) providing sub-second page transitions, modular component state management, and optimized asset bundling.</w:t>
+              <w:t>Single Page Application delivering instant navigation and modular component rendering.</w:t>
             </w:r>
           </w:p>
         </w:tc>
@@ -508,7 +783,7 @@
           </w:tcPr>
           <w:p>
             <w:r>
-              <w:t>Design &amp; Styling</w:t>
+              <w:t>Styling &amp; Theme</w:t>
             </w:r>
           </w:p>
         </w:tc>
@@ -542,7 +817,7 @@
           </w:tcPr>
           <w:p>
             <w:r>
-              <w:t>Utility-first design system utilizing Ice Blue (#F8FAFC) background, Deep Royal Navy (#1E3A8A) headers, and Cognitive Blue (#0284C7) controls.</w:t>
+              <w:t>Custom Ice Blue (#F8FAFC), Deep Royal Navy (#1E3A8A), and Cognitive Blue (#0284C7) palette.</w:t>
             </w:r>
           </w:p>
         </w:tc>
@@ -595,7 +870,7 @@
           </w:tcPr>
           <w:p>
             <w:r>
-              <w:t>Legibility-focused educational font supporting clean rendering for mathematical, Tamil script, and English text.</w:t>
+              <w:t>High-legibility font for mathematical symbols, Tamil script, and English body text.</w:t>
             </w:r>
           </w:p>
         </w:tc>
@@ -614,7 +889,7 @@
           </w:tcPr>
           <w:p>
             <w:r>
-              <w:t>Backend Server</w:t>
+              <w:t>Backend Framework</w:t>
             </w:r>
           </w:p>
         </w:tc>
@@ -648,7 +923,7 @@
           </w:tcPr>
           <w:p>
             <w:r>
-              <w:t>Asynchronous ASGI framework delivering high concurrency, automated OpenAPI validation, and lightweight payload parsing.</w:t>
+              <w:t>Asynchronous framework handling API routes, authentication, and news fetching.</w:t>
             </w:r>
           </w:p>
         </w:tc>
@@ -667,7 +942,7 @@
           </w:tcPr>
           <w:p>
             <w:r>
-              <w:t>Database Engine</w:t>
+              <w:t>Database Storage</w:t>
             </w:r>
           </w:p>
         </w:tc>
@@ -701,7 +976,7 @@
           </w:tcPr>
           <w:p>
             <w:r>
-              <w:t>Relational persistence storing user profiles, academic progress records, material definitions, and lesson metadata.</w:t>
+              <w:t>Relational database storing user progress, streak history, materials, and lessons.</w:t>
             </w:r>
           </w:p>
         </w:tc>
@@ -737,7 +1012,7 @@
           </w:tcPr>
           <w:p>
             <w:r>
-              <w:t>Google Gemini 1.5 Flash API</w:t>
+              <w:t>Google Gemini 1.5 Flash</w:t>
             </w:r>
           </w:p>
         </w:tc>
@@ -754,7 +1029,7 @@
           </w:tcPr>
           <w:p>
             <w:r>
-              <w:t>Large Language Model generating structured JSON question arrays with automated fallback mechanisms.</w:t>
+              <w:t>LLM generating structured 200 MCQ practice sets &amp; 100 timed exam papers.</w:t>
             </w:r>
           </w:p>
         </w:tc>
@@ -773,7 +1048,7 @@
           </w:tcPr>
           <w:p>
             <w:r>
-              <w:t>Web Server &amp; SSL</w:t>
+              <w:t>News Engine</w:t>
             </w:r>
           </w:p>
         </w:tc>
@@ -790,7 +1065,7 @@
           </w:tcPr>
           <w:p>
             <w:r>
-              <w:t>Nginx + Let's Encrypt SSL</w:t>
+              <w:t>Google News RSS Parser</w:t>
             </w:r>
           </w:p>
         </w:tc>
@@ -807,7 +1082,7 @@
           </w:tcPr>
           <w:p>
             <w:r>
-              <w:t>Reverse proxy server performing TLS termination, HTTP/2 multiplexing, static file caching, and daemon management.</w:t>
+              <w:t>Live RSS parser delivering real-time Tamil Nadu education &amp; TRB TET exam updates.</w:t>
             </w:r>
           </w:p>
         </w:tc>
@@ -824,569 +1099,7 @@
           <w:color w:val="1E3A8A"/>
           <w:sz w:val="32"/>
         </w:rPr>
-        <w:t>4. Deep-Dive Module Specifications</w:t>
-      </w:r>
-    </w:p>
-    <w:p>
-      <w:pPr>
-        <w:spacing w:before="240" w:after="80"/>
-      </w:pPr>
-      <w:r>
-        <w:rPr>
-          <w:rFonts w:ascii="Calibri" w:hAnsi="Calibri"/>
-          <w:b/>
-          <w:color w:val="0284C7"/>
-          <w:sz w:val="26"/>
-        </w:rPr>
-        <w:t>4.1. Authentication &amp; Role-Based Access Control (RBAC)</w:t>
-      </w:r>
-    </w:p>
-    <w:p>
-      <w:pPr>
-        <w:pStyle w:val="ListBullet"/>
-        <w:spacing w:before="40" w:after="40"/>
-      </w:pPr>
-      <w:r>
-        <w:rPr>
-          <w:b/>
-          <w:color w:val="1E3A8A"/>
-        </w:rPr>
-        <w:t xml:space="preserve">Login Entry Gate: </w:t>
-      </w:r>
-      <w:r>
-        <w:rPr>
-          <w:color w:val="1F2937"/>
-        </w:rPr>
-        <w:t>Mandatory authentication screen upon initial visit. Users choose Student Login or Admin Login.</w:t>
-      </w:r>
-    </w:p>
-    <w:p>
-      <w:pPr>
-        <w:pStyle w:val="ListBullet"/>
-        <w:spacing w:before="40" w:after="40"/>
-      </w:pPr>
-      <w:r>
-        <w:rPr>
-          <w:b/>
-          <w:color w:val="1E3A8A"/>
-        </w:rPr>
-        <w:t xml:space="preserve">Student Access Workflow: </w:t>
-      </w:r>
-      <w:r>
-        <w:rPr>
-          <w:color w:val="1F2937"/>
-        </w:rPr>
-        <w:t>Authenticates candidate credentials and redirects directly to the main Student Dashboard.</w:t>
-      </w:r>
-    </w:p>
-    <w:p>
-      <w:pPr>
-        <w:pStyle w:val="ListBullet"/>
-        <w:spacing w:before="40" w:after="40"/>
-      </w:pPr>
-      <w:r>
-        <w:rPr>
-          <w:b/>
-          <w:color w:val="1E3A8A"/>
-        </w:rPr>
-        <w:t xml:space="preserve">Admin Portal Workflow: </w:t>
-      </w:r>
-      <w:r>
-        <w:rPr>
-          <w:color w:val="1F2937"/>
-        </w:rPr>
-        <w:t>Authenticates administrative users and redirects directly to the Executive Admin Portal (activeTab = 'admin') with full upload and management permissions.</w:t>
-      </w:r>
-    </w:p>
-    <w:p>
-      <w:pPr>
-        <w:spacing w:before="240" w:after="80"/>
-      </w:pPr>
-      <w:r>
-        <w:rPr>
-          <w:rFonts w:ascii="Calibri" w:hAnsi="Calibri"/>
-          <w:b/>
-          <w:color w:val="0284C7"/>
-          <w:sz w:val="26"/>
-        </w:rPr>
-        <w:t>4.2. Materials Explorer (4-Grid Selection Engine)</w:t>
-      </w:r>
-    </w:p>
-    <w:p>
-      <w:r>
-        <w:t>The Materials Explorer provides an intuitive 4-step selection pipeline for finding study resources:</w:t>
-      </w:r>
-    </w:p>
-    <w:p>
-      <w:pPr>
-        <w:pStyle w:val="ListBullet"/>
-        <w:spacing w:before="40" w:after="40"/>
-      </w:pPr>
-      <w:r>
-        <w:rPr>
-          <w:b/>
-          <w:color w:val="1E3A8A"/>
-        </w:rPr>
-        <w:t xml:space="preserve">Grid 1 (Grade Level): </w:t>
-      </w:r>
-      <w:r>
-        <w:rPr>
-          <w:color w:val="1F2937"/>
-        </w:rPr>
-        <w:t>Class 1 through Class 12 interactive selection cards.</w:t>
-      </w:r>
-    </w:p>
-    <w:p>
-      <w:pPr>
-        <w:pStyle w:val="ListBullet"/>
-        <w:spacing w:before="40" w:after="40"/>
-      </w:pPr>
-      <w:r>
-        <w:rPr>
-          <w:b/>
-          <w:color w:val="1E3A8A"/>
-        </w:rPr>
-        <w:t xml:space="preserve">Grid 2 (Subject &amp; Medium): </w:t>
-      </w:r>
-      <w:r>
-        <w:rPr>
-          <w:color w:val="1F2937"/>
-        </w:rPr>
-        <w:t>Toggle between Tamil Medium (தமிழ் வழி) and English Medium (ஆங்கில வழி). Grades 1-10 present core subjects (Tamil, English, Maths, Science, Social Science). Grades 11-12 present specialized streams (Physics, Chemistry, Botany, Zoology, Computer Science, Commerce, Economics) and custom subjects.</w:t>
-      </w:r>
-    </w:p>
-    <w:p>
-      <w:pPr>
-        <w:pStyle w:val="ListBullet"/>
-        <w:spacing w:before="40" w:after="40"/>
-      </w:pPr>
-      <w:r>
-        <w:rPr>
-          <w:b/>
-          <w:color w:val="1E3A8A"/>
-        </w:rPr>
-        <w:t xml:space="preserve">Grid 3 (Academic Terms): </w:t>
-      </w:r>
-      <w:r>
-        <w:rPr>
-          <w:color w:val="1F2937"/>
-        </w:rPr>
-        <w:t>Filter materials by Term 1, Term 2, or Term 3.</w:t>
-      </w:r>
-    </w:p>
-    <w:p>
-      <w:pPr>
-        <w:pStyle w:val="ListBullet"/>
-        <w:spacing w:before="40" w:after="40"/>
-      </w:pPr>
-      <w:r>
-        <w:rPr>
-          <w:b/>
-          <w:color w:val="1E3A8A"/>
-        </w:rPr>
-        <w:t xml:space="preserve">Grid 4 (Preview &amp; Download Center): </w:t>
-      </w:r>
-      <w:r>
-        <w:rPr>
-          <w:color w:val="1F2937"/>
-        </w:rPr>
-        <w:t>Embedded high-resolution inline PDF viewer modal for instant reading without leaving the app, alongside direct file download triggers.</w:t>
-      </w:r>
-    </w:p>
-    <w:p>
-      <w:pPr>
-        <w:spacing w:before="240" w:after="80"/>
-      </w:pPr>
-      <w:r>
-        <w:rPr>
-          <w:rFonts w:ascii="Calibri" w:hAnsi="Calibri"/>
-          <w:b/>
-          <w:color w:val="0284C7"/>
-          <w:sz w:val="26"/>
-        </w:rPr>
-        <w:t>4.3. 4-Stage Sequential Learning Engine</w:t>
-      </w:r>
-    </w:p>
-    <w:p>
-      <w:r>
-        <w:t>To ensure comprehensive mastery, each lesson requires sequential completion of 4 locked stages:</w:t>
-      </w:r>
-    </w:p>
-    <w:p>
-      <w:pPr>
-        <w:pStyle w:val="ListBullet"/>
-        <w:spacing w:before="40" w:after="40"/>
-      </w:pPr>
-      <w:r>
-        <w:rPr>
-          <w:b/>
-          <w:color w:val="1E3A8A"/>
-        </w:rPr>
-        <w:t xml:space="preserve">Stage 1: PDF Reference Notes: </w:t>
-      </w:r>
-      <w:r>
-        <w:rPr>
-          <w:color w:val="1F2937"/>
-        </w:rPr>
-        <w:t>Student reads the topic reference PDF. Stage 2 unlocks only after clicking 'Mark PDF Read'.</w:t>
-      </w:r>
-    </w:p>
-    <w:p>
-      <w:pPr>
-        <w:pStyle w:val="ListBullet"/>
-        <w:spacing w:before="40" w:after="40"/>
-      </w:pPr>
-      <w:r>
-        <w:rPr>
-          <w:b/>
-          <w:color w:val="1E3A8A"/>
-        </w:rPr>
-        <w:t xml:space="preserve">Stage 2: Interactive Video Lecture: </w:t>
-      </w:r>
-      <w:r>
-        <w:rPr>
-          <w:color w:val="1F2937"/>
-        </w:rPr>
-        <w:t>Full-screen video player embedding curated lecture content. Stage 3 unlocks after clicking 'Mark Video Watched'.</w:t>
-      </w:r>
-    </w:p>
-    <w:p>
-      <w:pPr>
-        <w:pStyle w:val="ListBullet"/>
-        <w:spacing w:before="40" w:after="40"/>
-      </w:pPr>
-      <w:r>
-        <w:rPr>
-          <w:b/>
-          <w:color w:val="1E3A8A"/>
-        </w:rPr>
-        <w:t xml:space="preserve">Stage 3: 200 AI MCQs Practice Bank: </w:t>
-      </w:r>
-      <w:r>
-        <w:rPr>
-          <w:color w:val="1F2937"/>
-        </w:rPr>
-        <w:t>Dynamic practice set of 200 multiple-choice questions powered by Google Gemini AI with instant answer verification and explanations.</w:t>
-      </w:r>
-    </w:p>
-    <w:p>
-      <w:pPr>
-        <w:pStyle w:val="ListBullet"/>
-        <w:spacing w:before="40" w:after="40"/>
-      </w:pPr>
-      <w:r>
-        <w:rPr>
-          <w:b/>
-          <w:color w:val="1E3A8A"/>
-        </w:rPr>
-        <w:t xml:space="preserve">Stage 4: 100 AI Timed Test Exam: </w:t>
-      </w:r>
-      <w:r>
-        <w:rPr>
-          <w:color w:val="1F2937"/>
-        </w:rPr>
-        <w:t>60-minute timed exam environment presenting 100 questions. Scoring &gt;= 60% completes the lesson, unlocks the next lesson in sequence, and increments the daily streak.</w:t>
-      </w:r>
-    </w:p>
-    <w:p>
-      <w:pPr>
-        <w:spacing w:before="240" w:after="80"/>
-      </w:pPr>
-      <w:r>
-        <w:rPr>
-          <w:rFonts w:ascii="Calibri" w:hAnsi="Calibri"/>
-          <w:b/>
-          <w:color w:val="0284C7"/>
-          <w:sz w:val="26"/>
-        </w:rPr>
-        <w:t>4.4. Gamification &amp; Student Engagement System</w:t>
-      </w:r>
-    </w:p>
-    <w:p>
-      <w:pPr>
-        <w:pStyle w:val="ListBullet"/>
-        <w:spacing w:before="40" w:after="40"/>
-      </w:pPr>
-      <w:r>
-        <w:rPr>
-          <w:b/>
-          <w:color w:val="1E3A8A"/>
-        </w:rPr>
-        <w:t xml:space="preserve">Daily Progress Status Bar: </w:t>
-      </w:r>
-      <w:r>
-        <w:rPr>
-          <w:color w:val="1F2937"/>
-        </w:rPr>
-        <w:t>Real-time visual percentage indicator showing daily stage completion.</w:t>
-      </w:r>
-    </w:p>
-    <w:p>
-      <w:pPr>
-        <w:pStyle w:val="ListBullet"/>
-        <w:spacing w:before="40" w:after="40"/>
-      </w:pPr>
-      <w:r>
-        <w:rPr>
-          <w:b/>
-          <w:color w:val="1E3A8A"/>
-        </w:rPr>
-        <w:t xml:space="preserve">Active Day Streak Counter: </w:t>
-      </w:r>
-      <w:r>
-        <w:rPr>
-          <w:color w:val="1F2937"/>
-        </w:rPr>
-        <w:t>Prominent 🔥 Day Streak tracker rewarding consistent daily login and study activity.</w:t>
-      </w:r>
-    </w:p>
-    <w:p>
-      <w:pPr>
-        <w:pStyle w:val="ListBullet"/>
-        <w:spacing w:before="40" w:after="40"/>
-      </w:pPr>
-      <w:r>
-        <w:rPr>
-          <w:b/>
-          <w:color w:val="1E3A8A"/>
-        </w:rPr>
-        <w:t xml:space="preserve">Milestone Badges: </w:t>
-      </w:r>
-      <w:r>
-        <w:rPr>
-          <w:color w:val="1F2937"/>
-        </w:rPr>
-        <w:t>Automated badge unlocking: Quick Starter (3 Days), Bronze Scholar (7 Days), Silver Academic (25 Days), and 50-Streak Diamond Legend (50 Days).</w:t>
-      </w:r>
-    </w:p>
-    <w:p>
-      <w:pPr>
-        <w:spacing w:before="240" w:after="80"/>
-      </w:pPr>
-      <w:r>
-        <w:rPr>
-          <w:rFonts w:ascii="Calibri" w:hAnsi="Calibri"/>
-          <w:b/>
-          <w:color w:val="0284C7"/>
-          <w:sz w:val="26"/>
-        </w:rPr>
-        <w:t>4.5. Executive Admin Management Portal</w:t>
-      </w:r>
-    </w:p>
-    <w:p>
-      <w:pPr>
-        <w:pStyle w:val="ListBullet"/>
-        <w:spacing w:before="40" w:after="40"/>
-      </w:pPr>
-      <w:r>
-        <w:rPr>
-          <w:b/>
-          <w:color w:val="1E3A8A"/>
-        </w:rPr>
-        <w:t xml:space="preserve">Dedicated Upload Workflows: </w:t>
-      </w:r>
-      <w:r>
-        <w:rPr>
-          <w:color w:val="1F2937"/>
-        </w:rPr>
-        <w:t>Separate tabs for Materials Explorer PDFs vs Learning Portal 4-stage lesson modules.</w:t>
-      </w:r>
-    </w:p>
-    <w:p>
-      <w:pPr>
-        <w:pStyle w:val="ListBullet"/>
-        <w:spacing w:before="40" w:after="40"/>
-      </w:pPr>
-      <w:r>
-        <w:rPr>
-          <w:b/>
-          <w:color w:val="1E3A8A"/>
-        </w:rPr>
-        <w:t xml:space="preserve">Dynamic Subject Management: </w:t>
-      </w:r>
-      <w:r>
-        <w:rPr>
-          <w:color w:val="1F2937"/>
-        </w:rPr>
-        <w:t>Add custom subjects for specialized Higher Secondary streams instantly.</w:t>
-      </w:r>
-    </w:p>
-    <w:p>
-      <w:pPr>
-        <w:pStyle w:val="ListBullet"/>
-        <w:spacing w:before="40" w:after="40"/>
-      </w:pPr>
-      <w:r>
-        <w:rPr>
-          <w:b/>
-          <w:color w:val="1E3A8A"/>
-        </w:rPr>
-        <w:t xml:space="preserve">Gemini AI Configurator: </w:t>
-      </w:r>
-      <w:r>
-        <w:rPr>
-          <w:color w:val="1F2937"/>
-        </w:rPr>
-        <w:t>Input and manage Gemini API keys with direct link to Google AI Studio.</w:t>
-      </w:r>
-    </w:p>
-    <w:p>
-      <w:pPr>
-        <w:pStyle w:val="ListBullet"/>
-        <w:spacing w:before="40" w:after="40"/>
-      </w:pPr>
-      <w:r>
-        <w:rPr>
-          <w:b/>
-          <w:color w:val="1E3A8A"/>
-        </w:rPr>
-        <w:t xml:space="preserve">Toast Alert System: </w:t>
-      </w:r>
-      <w:r>
-        <w:rPr>
-          <w:color w:val="1F2937"/>
-        </w:rPr>
-        <w:t>Top-right glassmorphic dynamic toast notifications providing real-time operational feedback.</w:t>
-      </w:r>
-    </w:p>
-    <w:p>
-      <w:pPr>
-        <w:spacing w:before="360" w:after="120"/>
-      </w:pPr>
-      <w:r>
-        <w:rPr>
-          <w:rFonts w:ascii="Calibri" w:hAnsi="Calibri"/>
-          <w:b/>
-          <w:color w:val="1E3A8A"/>
-          <w:sz w:val="32"/>
-        </w:rPr>
-        <w:t>5. Google Gemini AI Engine Architecture &amp; Fallback Resiliency</w:t>
-      </w:r>
-    </w:p>
-    <w:p>
-      <w:r>
-        <w:t>The platform utilizes Google Gemini 1.5 Flash AI for automated evaluation and question generation. To ensure uninterrupted service, the platform includes a Zero-Cost Smart Fallback Engine.</w:t>
-      </w:r>
-    </w:p>
-    <w:tbl>
-      <w:tblPr>
-        <w:tblW w:type="auto" w:w="0"/>
-        <w:tblLook w:firstColumn="1" w:firstRow="1" w:lastColumn="0" w:lastRow="0" w:noHBand="0" w:noVBand="1" w:val="04A0"/>
-        <w:tblBorders>
-          <w:top w:val="single" w:sz="4" w:space="0" w:color="0284C7"/>
-          <w:bottom w:val="single" w:sz="4" w:space="0" w:color="0284C7"/>
-          <w:insideH w:val="single" w:sz="4" w:space="0" w:color="0284C7"/>
-          <w:insideV w:val="none"/>
-          <w:left w:val="none"/>
-          <w:right w:val="none"/>
-        </w:tblBorders>
-      </w:tblPr>
-      <w:tblGrid>
-        <w:gridCol w:w="9360"/>
-      </w:tblGrid>
-      <w:tr>
-        <w:tc>
-          <w:tcPr>
-            <w:tcW w:type="dxa" w:w="9360"/>
-            <w:shd w:fill="F0FDF4"/>
-            <w:tcMar>
-              <w:top w:w="120" w:type="dxa"/>
-              <w:bottom w:w="120" w:type="dxa"/>
-              <w:left w:w="150" w:type="dxa"/>
-              <w:right w:w="150" w:type="dxa"/>
-            </w:tcMar>
-          </w:tcPr>
-          <w:p>
-            <w:r>
-              <w:rPr>
-                <w:b/>
-                <w:color w:val="1E3A8A"/>
-              </w:rPr>
-              <w:t>AI Resiliency &amp; Automated Fallback Mechanism:</w:t>
-              <w:br/>
-            </w:r>
-            <w:r>
-              <w:t>1. Dynamic Prompt Construction: Formats subject, class level, medium, and topic into structured JSON prompts.</w:t>
-              <w:br/>
-              <w:t>2. Rate Limit &amp; Error Handling: Automatically detects API quota limits (1,500 requests/day free allowance) or network timeouts.</w:t>
-              <w:br/>
-              <w:t>3. Zero-Cost Smart Fallback Engine: Seamlessly switches to local curriculum-aligned fallback question repositories if API key is unconfigured or rate limits are reached.</w:t>
-              <w:br/>
-              <w:t>4. Output Parsing &amp; Sanitization: Validates question structure, options array, correct option index, and explanation string prior to rendering.</w:t>
-            </w:r>
-          </w:p>
-        </w:tc>
-      </w:tr>
-    </w:tbl>
-    <w:p>
-      <w:pPr>
-        <w:spacing w:before="360" w:after="120"/>
-      </w:pPr>
-      <w:r>
-        <w:rPr>
-          <w:rFonts w:ascii="Calibri" w:hAnsi="Calibri"/>
-          <w:b/>
-          <w:color w:val="1E3A8A"/>
-          <w:sz w:val="32"/>
-        </w:rPr>
-        <w:t>6. Data Persistence &amp; Synchronization Strategy</w:t>
-      </w:r>
-    </w:p>
-    <w:p>
-      <w:r>
-        <w:t>To provide instant offline resiliency and stateless cloud deployment support (e.g. Vercel static previews alongside VPS production), the platform implements a dual-layer persistence model:</w:t>
-      </w:r>
-    </w:p>
-    <w:p>
-      <w:pPr>
-        <w:pStyle w:val="ListBullet"/>
-        <w:spacing w:before="40" w:after="40"/>
-      </w:pPr>
-      <w:r>
-        <w:rPr>
-          <w:b/>
-          <w:color w:val="1E3A8A"/>
-        </w:rPr>
-        <w:t xml:space="preserve">Layer 1 (Client-Side LocalStorage Persistence): </w:t>
-      </w:r>
-      <w:r>
-        <w:rPr>
-          <w:color w:val="1F2937"/>
-        </w:rPr>
-        <w:t>Uploaded materials and lesson definitions created in the Admin Portal are instantly cached in browser local storage (saveUploadedMaterialClient &amp; saveUploadedLessonClient). This ensures uploaded materials persist across browser reloads even on stateless deployments.</w:t>
-      </w:r>
-    </w:p>
-    <w:p>
-      <w:pPr>
-        <w:pStyle w:val="ListBullet"/>
-        <w:spacing w:before="40" w:after="40"/>
-      </w:pPr>
-      <w:r>
-        <w:rPr>
-          <w:b/>
-          <w:color w:val="1E3A8A"/>
-        </w:rPr>
-        <w:t xml:space="preserve">Layer 2 (Relational Database Storage): </w:t>
-      </w:r>
-      <w:r>
-        <w:rPr>
-          <w:color w:val="1F2937"/>
-        </w:rPr>
-        <w:t>FastAPI syncs user credentials, test scores, streak counters, and curriculum records to SQLite/PostgreSQL on the VPS server.</w:t>
-      </w:r>
-    </w:p>
-    <w:p>
-      <w:pPr>
-        <w:spacing w:before="360" w:after="120"/>
-      </w:pPr>
-      <w:r>
-        <w:rPr>
-          <w:rFonts w:ascii="Calibri" w:hAnsi="Calibri"/>
-          <w:b/>
-          <w:color w:val="1E3A8A"/>
-          <w:sz w:val="32"/>
-        </w:rPr>
-        <w:t>7. Production Deployment Blueprint (BigRock VPS)</w:t>
+        <w:t>6. Production Deployment Blueprint (BigRock VPS)</w:t>
       </w:r>
     </w:p>
     <w:p>
@@ -1458,7 +1171,7 @@
           <w:color w:val="0284C7"/>
           <w:sz w:val="26"/>
         </w:rPr>
-        <w:t>Step 2: Codebase Repository Setup &amp; Backend Service</w:t>
+        <w:t>Step 2: Repository Clone &amp; Backend Service Deployment</w:t>
       </w:r>
     </w:p>
     <w:tbl>
@@ -1568,7 +1281,7 @@
           <w:color w:val="0284C7"/>
           <w:sz w:val="26"/>
         </w:rPr>
-        <w:t>Step 4: Nginx Reverse Proxy &amp; SSL Configuration</w:t>
+        <w:t>Step 4: Nginx Reverse Proxy &amp; SSL Certificate</w:t>
       </w:r>
     </w:p>
     <w:tbl>
@@ -1619,12 +1332,12 @@
           <w:color w:val="1E3A8A"/>
           <w:sz w:val="32"/>
         </w:rPr>
-        <w:t>8. Technical Sign-Off &amp; Verification</w:t>
+        <w:t>7. Technical Sign-Off &amp; Verification</w:t>
       </w:r>
     </w:p>
     <w:p>
       <w:r>
-        <w:t>This document establishes the official technical specification and operational proof of concept for the TET Platform (tnteachers.in). All core modules, AI integrations, translation engines, and administrative portals are fully validated and production-ready.</w:t>
+        <w:t>This document establishes the official technical specification and operational proof of concept for the TET Platform (tnteachers.in). All core modules, quiz engines, news feeds, translation frameworks, and administrative portals are fully validated and production-ready.</w:t>
       </w:r>
     </w:p>
     <w:sectPr>

</xml_diff>